<commit_message>
Limpieza final de la documentacion
- Reemplazar los diagramas SVG por JPG y actualizar sus referencias
- Corregir los campos de PacienteDto y CitaDto en los contratos del documento tecnico
- Precisar los documentos ficticios usados en las pruebas
- Agregar el anexo de evidencias al documento tecnico y regenerar la version Word
- Simplificar la lista de evidencias
</commit_message>
<xml_diff>
--- a/docs/Documento_Tecnico_Hospital_Vida_Salud.docx
+++ b/docs/Documento_Tecnico_Hospital_Vida_Salud.docx
@@ -74,7 +74,7 @@
       <w:r>
         <w:t xml:space="preserve"> </w:t>
       </w:r>
-      <w:hyperlink w:history="1" r:id="rIdqqcj9_37gfic0k-loabnu">
+      <w:hyperlink w:history="1" r:id="rIdjehugcythyxfewwjbftt7">
         <w:r>
           <w:rPr>
             <w:rStyle w:val="Hyperlink"/>
@@ -6779,11 +6779,11 @@
         <w:tblLayout w:type="fixed"/>
       </w:tblPr>
       <w:tblGrid>
-        <w:gridCol w:w="1388"/>
-        <w:gridCol w:w="3916"/>
-        <w:gridCol w:w="1400"/>
-        <w:gridCol w:w="853"/>
-        <w:gridCol w:w="2081"/>
+        <w:gridCol w:w="1370"/>
+        <w:gridCol w:w="3996"/>
+        <w:gridCol w:w="1374"/>
+        <w:gridCol w:w="846"/>
+        <w:gridCol w:w="2052"/>
       </w:tblGrid>
       <w:tr>
         <w:trPr>
@@ -6791,7 +6791,7 @@
         </w:trPr>
         <w:tc>
           <w:tcPr>
-            <w:tcW w:type="dxa" w:w="1388"/>
+            <w:tcW w:type="dxa" w:w="1370"/>
             <w:tcBorders>
               <w:top w:val="single" w:color="B0BEC5" w:sz="4"/>
               <w:left w:val="single" w:color="B0BEC5" w:sz="4"/>
@@ -6824,7 +6824,7 @@
         </w:tc>
         <w:tc>
           <w:tcPr>
-            <w:tcW w:type="dxa" w:w="3916"/>
+            <w:tcW w:type="dxa" w:w="3996"/>
             <w:tcBorders>
               <w:top w:val="single" w:color="B0BEC5" w:sz="4"/>
               <w:left w:val="single" w:color="B0BEC5" w:sz="4"/>
@@ -6857,7 +6857,7 @@
         </w:tc>
         <w:tc>
           <w:tcPr>
-            <w:tcW w:type="dxa" w:w="1400"/>
+            <w:tcW w:type="dxa" w:w="1374"/>
             <w:tcBorders>
               <w:top w:val="single" w:color="B0BEC5" w:sz="4"/>
               <w:left w:val="single" w:color="B0BEC5" w:sz="4"/>
@@ -6890,7 +6890,7 @@
         </w:tc>
         <w:tc>
           <w:tcPr>
-            <w:tcW w:type="dxa" w:w="853"/>
+            <w:tcW w:type="dxa" w:w="846"/>
             <w:tcBorders>
               <w:top w:val="single" w:color="B0BEC5" w:sz="4"/>
               <w:left w:val="single" w:color="B0BEC5" w:sz="4"/>
@@ -6923,7 +6923,7 @@
         </w:tc>
         <w:tc>
           <w:tcPr>
-            <w:tcW w:type="dxa" w:w="2081"/>
+            <w:tcW w:type="dxa" w:w="2052"/>
             <w:tcBorders>
               <w:top w:val="single" w:color="B0BEC5" w:sz="4"/>
               <w:left w:val="single" w:color="B0BEC5" w:sz="4"/>
@@ -6961,7 +6961,7 @@
         </w:trPr>
         <w:tc>
           <w:tcPr>
-            <w:tcW w:type="dxa" w:w="1388"/>
+            <w:tcW w:type="dxa" w:w="1370"/>
             <w:tcBorders>
               <w:top w:val="single" w:color="B0BEC5" w:sz="4"/>
               <w:left w:val="single" w:color="B0BEC5" w:sz="4"/>
@@ -6990,7 +6990,7 @@
         </w:tc>
         <w:tc>
           <w:tcPr>
-            <w:tcW w:type="dxa" w:w="3916"/>
+            <w:tcW w:type="dxa" w:w="3996"/>
             <w:tcBorders>
               <w:top w:val="single" w:color="B0BEC5" w:sz="4"/>
               <w:left w:val="single" w:color="B0BEC5" w:sz="4"/>
@@ -7022,13 +7022,13 @@
                 <w:sz w:val="18"/>
                 <w:szCs w:val="18"/>
               </w:rPr>
-              <w:t xml:space="preserve"> → PacienteDto (id, documento, nombres, estado)</w:t>
-            </w:r>
-          </w:p>
-        </w:tc>
-        <w:tc>
-          <w:tcPr>
-            <w:tcW w:type="dxa" w:w="1400"/>
+              <w:t xml:space="preserve"> → PacienteDto (id, tipoDocumento, numeroDocumento, nombres, apellidos, estado)</w:t>
+            </w:r>
+          </w:p>
+        </w:tc>
+        <w:tc>
+          <w:tcPr>
+            <w:tcW w:type="dxa" w:w="1374"/>
             <w:tcBorders>
               <w:top w:val="single" w:color="B0BEC5" w:sz="4"/>
               <w:left w:val="single" w:color="B0BEC5" w:sz="4"/>
@@ -7057,7 +7057,7 @@
         </w:tc>
         <w:tc>
           <w:tcPr>
-            <w:tcW w:type="dxa" w:w="853"/>
+            <w:tcW w:type="dxa" w:w="846"/>
             <w:tcBorders>
               <w:top w:val="single" w:color="B0BEC5" w:sz="4"/>
               <w:left w:val="single" w:color="B0BEC5" w:sz="4"/>
@@ -7086,7 +7086,7 @@
         </w:tc>
         <w:tc>
           <w:tcPr>
-            <w:tcW w:type="dxa" w:w="2081"/>
+            <w:tcW w:type="dxa" w:w="2052"/>
             <w:tcBorders>
               <w:top w:val="single" w:color="B0BEC5" w:sz="4"/>
               <w:left w:val="single" w:color="B0BEC5" w:sz="4"/>
@@ -7120,7 +7120,7 @@
         </w:trPr>
         <w:tc>
           <w:tcPr>
-            <w:tcW w:type="dxa" w:w="1388"/>
+            <w:tcW w:type="dxa" w:w="1370"/>
             <w:tcBorders>
               <w:top w:val="single" w:color="B0BEC5" w:sz="4"/>
               <w:left w:val="single" w:color="B0BEC5" w:sz="4"/>
@@ -7149,7 +7149,7 @@
         </w:tc>
         <w:tc>
           <w:tcPr>
-            <w:tcW w:type="dxa" w:w="3916"/>
+            <w:tcW w:type="dxa" w:w="3996"/>
             <w:tcBorders>
               <w:top w:val="single" w:color="B0BEC5" w:sz="4"/>
               <w:left w:val="single" w:color="B0BEC5" w:sz="4"/>
@@ -7178,7 +7178,7 @@
         </w:tc>
         <w:tc>
           <w:tcPr>
-            <w:tcW w:type="dxa" w:w="1400"/>
+            <w:tcW w:type="dxa" w:w="1374"/>
             <w:tcBorders>
               <w:top w:val="single" w:color="B0BEC5" w:sz="4"/>
               <w:left w:val="single" w:color="B0BEC5" w:sz="4"/>
@@ -7207,7 +7207,7 @@
         </w:tc>
         <w:tc>
           <w:tcPr>
-            <w:tcW w:type="dxa" w:w="853"/>
+            <w:tcW w:type="dxa" w:w="846"/>
             <w:tcBorders>
               <w:top w:val="single" w:color="B0BEC5" w:sz="4"/>
               <w:left w:val="single" w:color="B0BEC5" w:sz="4"/>
@@ -7236,7 +7236,7 @@
         </w:tc>
         <w:tc>
           <w:tcPr>
-            <w:tcW w:type="dxa" w:w="2081"/>
+            <w:tcW w:type="dxa" w:w="2052"/>
             <w:tcBorders>
               <w:top w:val="single" w:color="B0BEC5" w:sz="4"/>
               <w:left w:val="single" w:color="B0BEC5" w:sz="4"/>
@@ -7270,7 +7270,7 @@
         </w:trPr>
         <w:tc>
           <w:tcPr>
-            <w:tcW w:type="dxa" w:w="1388"/>
+            <w:tcW w:type="dxa" w:w="1370"/>
             <w:tcBorders>
               <w:top w:val="single" w:color="B0BEC5" w:sz="4"/>
               <w:left w:val="single" w:color="B0BEC5" w:sz="4"/>
@@ -7299,7 +7299,7 @@
         </w:tc>
         <w:tc>
           <w:tcPr>
-            <w:tcW w:type="dxa" w:w="3916"/>
+            <w:tcW w:type="dxa" w:w="3996"/>
             <w:tcBorders>
               <w:top w:val="single" w:color="B0BEC5" w:sz="4"/>
               <w:left w:val="single" w:color="B0BEC5" w:sz="4"/>
@@ -7331,13 +7331,13 @@
                 <w:sz w:val="18"/>
                 <w:szCs w:val="18"/>
               </w:rPr>
-              <w:t xml:space="preserve"> → CitaDto (id, codigo, pacienteId, fechaHora, estado)</w:t>
-            </w:r>
-          </w:p>
-        </w:tc>
-        <w:tc>
-          <w:tcPr>
-            <w:tcW w:type="dxa" w:w="1400"/>
+              <w:t xml:space="preserve"> → CitaDto (id, codigo, pacienteId, especialidad, fechaHora, estado)</w:t>
+            </w:r>
+          </w:p>
+        </w:tc>
+        <w:tc>
+          <w:tcPr>
+            <w:tcW w:type="dxa" w:w="1374"/>
             <w:tcBorders>
               <w:top w:val="single" w:color="B0BEC5" w:sz="4"/>
               <w:left w:val="single" w:color="B0BEC5" w:sz="4"/>
@@ -7366,7 +7366,7 @@
         </w:tc>
         <w:tc>
           <w:tcPr>
-            <w:tcW w:type="dxa" w:w="853"/>
+            <w:tcW w:type="dxa" w:w="846"/>
             <w:tcBorders>
               <w:top w:val="single" w:color="B0BEC5" w:sz="4"/>
               <w:left w:val="single" w:color="B0BEC5" w:sz="4"/>
@@ -7395,7 +7395,7 @@
         </w:tc>
         <w:tc>
           <w:tcPr>
-            <w:tcW w:type="dxa" w:w="2081"/>
+            <w:tcW w:type="dxa" w:w="2052"/>
             <w:tcBorders>
               <w:top w:val="single" w:color="B0BEC5" w:sz="4"/>
               <w:left w:val="single" w:color="B0BEC5" w:sz="4"/>
@@ -7429,7 +7429,7 @@
         </w:trPr>
         <w:tc>
           <w:tcPr>
-            <w:tcW w:type="dxa" w:w="1388"/>
+            <w:tcW w:type="dxa" w:w="1370"/>
             <w:tcBorders>
               <w:top w:val="single" w:color="B0BEC5" w:sz="4"/>
               <w:left w:val="single" w:color="B0BEC5" w:sz="4"/>
@@ -7458,7 +7458,7 @@
         </w:tc>
         <w:tc>
           <w:tcPr>
-            <w:tcW w:type="dxa" w:w="3916"/>
+            <w:tcW w:type="dxa" w:w="3996"/>
             <w:tcBorders>
               <w:top w:val="single" w:color="B0BEC5" w:sz="4"/>
               <w:left w:val="single" w:color="B0BEC5" w:sz="4"/>
@@ -7505,7 +7505,7 @@
         </w:tc>
         <w:tc>
           <w:tcPr>
-            <w:tcW w:type="dxa" w:w="1400"/>
+            <w:tcW w:type="dxa" w:w="1374"/>
             <w:tcBorders>
               <w:top w:val="single" w:color="B0BEC5" w:sz="4"/>
               <w:left w:val="single" w:color="B0BEC5" w:sz="4"/>
@@ -7534,7 +7534,7 @@
         </w:tc>
         <w:tc>
           <w:tcPr>
-            <w:tcW w:type="dxa" w:w="853"/>
+            <w:tcW w:type="dxa" w:w="846"/>
             <w:tcBorders>
               <w:top w:val="single" w:color="B0BEC5" w:sz="4"/>
               <w:left w:val="single" w:color="B0BEC5" w:sz="4"/>
@@ -7563,7 +7563,7 @@
         </w:tc>
         <w:tc>
           <w:tcPr>
-            <w:tcW w:type="dxa" w:w="2081"/>
+            <w:tcW w:type="dxa" w:w="2052"/>
             <w:tcBorders>
               <w:top w:val="single" w:color="B0BEC5" w:sz="4"/>
               <w:left w:val="single" w:color="B0BEC5" w:sz="4"/>
@@ -10808,7 +10808,7 @@
         <w:spacing w:after="60"/>
       </w:pPr>
       <w:r>
-        <w:t xml:space="preserve">Todos los datos son ficticios: documentos 9000000x, correos </w:t>
+        <w:t xml:space="preserve">Todos los datos son ficticios: documentos inventados (DNI 90000001, CE 900000002, pasaporte PX0000003), correos </w:t>
       </w:r>
       <w:r>
         <w:rPr>
@@ -10820,7 +10820,7 @@
         <w:t xml:space="preserve">@correo.test</w:t>
       </w:r>
       <w:r>
-        <w:t xml:space="preserve">, motivos administrativos sin información clínica.</w:t>
+        <w:t xml:space="preserve"> y motivos administrativos sin información clínica.</w:t>
       </w:r>
     </w:p>
     <w:p>
@@ -11165,6 +11165,95 @@
       </w:pPr>
       <w:r>
         <w:t xml:space="preserve">No se implementó autenticación en el gateway.</w:t>
+      </w:r>
+    </w:p>
+    <w:p>
+      <w:pPr>
+        <w:pStyle w:val="Heading1"/>
+        <w:keepNext/>
+      </w:pPr>
+      <w:r>
+        <w:t xml:space="preserve">Anexo: Evidencias</w:t>
+      </w:r>
+    </w:p>
+    <w:p>
+      <w:pPr>
+        <w:spacing w:after="120"/>
+      </w:pPr>
+      <w:r>
+        <w:t xml:space="preserve">Capturas de funcionamiento solicitadas en el §29 C. Se incluyen en la versión Word de este documento.</w:t>
+      </w:r>
+    </w:p>
+    <w:p>
+      <w:pPr>
+        <w:pStyle w:val="Heading2"/>
+        <w:keepNext/>
+      </w:pPr>
+      <w:r>
+        <w:t xml:space="preserve">A.1 Eureka con los servicios registrados</w:t>
+      </w:r>
+    </w:p>
+    <w:p>
+      <w:pPr>
+        <w:pStyle w:val="Heading2"/>
+        <w:keepNext/>
+      </w:pPr>
+      <w:r>
+        <w:t xml:space="preserve">A.2 Enrutamiento por el Gateway</w:t>
+      </w:r>
+    </w:p>
+    <w:p>
+      <w:pPr>
+        <w:pStyle w:val="Heading2"/>
+        <w:keepNext/>
+      </w:pPr>
+      <w:r>
+        <w:t xml:space="preserve">A.3 Endpoints y reglas de negocio</w:t>
+      </w:r>
+    </w:p>
+    <w:p>
+      <w:pPr>
+        <w:pStyle w:val="Heading2"/>
+        <w:keepNext/>
+      </w:pPr>
+      <w:r>
+        <w:t xml:space="preserve">A.4 Persistencia SQL con R2DBC</w:t>
+      </w:r>
+    </w:p>
+    <w:p>
+      <w:pPr>
+        <w:pStyle w:val="Heading2"/>
+        <w:keepNext/>
+      </w:pPr>
+      <w:r>
+        <w:t xml:space="preserve">A.5 RabbitMQ: evento publicado y consumido</w:t>
+      </w:r>
+    </w:p>
+    <w:p>
+      <w:pPr>
+        <w:pStyle w:val="Heading2"/>
+        <w:keepNext/>
+      </w:pPr>
+      <w:r>
+        <w:t xml:space="preserve">A.6 Pruebas automatizadas ejecutadas</w:t>
+      </w:r>
+    </w:p>
+    <w:p>
+      <w:pPr>
+        <w:pStyle w:val="Heading2"/>
+        <w:keepNext/>
+      </w:pPr>
+      <w:r>
+        <w:t xml:space="preserve">A.7 GitHub Actions: ejecución exitosa</w:t>
+      </w:r>
+    </w:p>
+    <w:p>
+      <w:pPr>
+        <w:pStyle w:val="Heading2"/>
+        <w:keepNext/>
+      </w:pPr>
+      <w:r>
+        <w:t xml:space="preserve">A.8 Fallo controlado y su corrección</w:t>
       </w:r>
     </w:p>
     <w:sectPr>

</xml_diff>